<commit_message>
Record Designated OMP identity from authorised sample details
CR-12.7 resolved: Dr C. P. Green-Thompson, HPCSA Reg No. MP 0195952,
SASOM Membership SAS1270, recorded in factory config, the sign off
template role line, the queued draft placeholders, and the register.
Authorisation was limited to the practitioner details; no other
content from the supplied sample was ingested, per POPIA. Pack
re-rendered with the OMP identity; geometry verification passes
16 of 16.

Co-Authored-By: Claude Fable 5 <noreply@anthropic.com>
Claude-Session: https://claude.ai/code/session_01LD1oxYugTPWbtSLxWpk37r
</commit_message>
<xml_diff>
--- a/msp-forge/factory/CNC-MSP-2026-0812-001_Medical_Surveillance_Plan_DRAFT.docx
+++ b/msp-forge/factory/CNC-MSP-2026-0812-001_Medical_Surveillance_Plan_DRAFT.docx
@@ -615,7 +615,7 @@
                 <w:sz w:val="17"/>
                 <w:szCs w:val="17"/>
               </w:rPr>
-              <w:t xml:space="preserve">[Designated OMP per CR-12.7, inserted at OMP approval]</w:t>
+              <w:t xml:space="preserve">Dr C. P. Green-Thompson | HPCSA Reg No. MP 0195952 | SASOM Membership SAS1270 (approval pending, Section 11.1)</w:t>
             </w:r>
           </w:p>
         </w:tc>
@@ -1140,7 +1140,7 @@
                 <w:sz w:val="17"/>
                 <w:szCs w:val="17"/>
               </w:rPr>
-              <w:t xml:space="preserve">[Designated OMP per CR-12.7, inserted at OMP approval]</w:t>
+              <w:t xml:space="preserve">Dr C. P. Green-Thompson | HPCSA Reg No. MP 0195952 | SASOM Membership SAS1270 (approval pending, Section 11.1)</w:t>
             </w:r>
           </w:p>
         </w:tc>
@@ -13804,7 +13804,7 @@
           <w:sz w:val="19"/>
           <w:szCs w:val="19"/>
         </w:rPr>
-        <w:t xml:space="preserve">Role: Designated Occupational Medical Practitioner, HPCSA Practice No. [Practice Number]</w:t>
+        <w:t xml:space="preserve">Role: Designated Occupational Medical Practitioner. Dr C. P. Green-Thompson | HPCSA Reg No. MP 0195952 | SASOM Membership SAS1270</w:t>
       </w:r>
     </w:p>
     <w:p>

</xml_diff>